<commit_message>
feat(certif): dates de réalisation effectives sur le certificat
- build_certif_template.py : label "Dates de réalisation" + tag {{ dates_realisees }}
- templates/certificat.docx : template régénéré
- document_gen.py : generate_certificat() accepte dates_realisees (optionnel)
  → fallback sur dates_previsionnelles si non fourni
  CertificatRenderer.generate_all() accepte dates_realisees_per_group
- app.py : _get_dates_realisees() collecte les dates DJ de l'UI (session_state)
  et les passe au renderer → chaque certificat affiche les vraies dates de session
- tests/test_certif_gen.py : +1 test (dates_realisees_injectees) → 8/8

Co-Authored-By: Claude Sonnet 4.6 <noreply@anthropic.com>
</commit_message>
<xml_diff>
--- a/templates/certificat.docx
+++ b/templates/certificat.docx
@@ -640,43 +640,8 @@
               </w:rPr>
             </w:pPr>
             <w:r>
-              <w:rPr>
-                <w:rFonts w:ascii="Source Sans Pro" w:hAnsi="Source Sans Pro" w:cs="Arial"/>
-                <w:bCs/>
-                <w:snapToGrid w:val="0"/>
-                <w:szCs w:val="16"/>
-              </w:rPr>
-              <w:t xml:space="preserve">Dates </w:t>
+              <w:t xml:space="preserve">Dates de réalisation</w:t>
             </w:r>
-            <w:r>
-              <w:rPr>
-                <w:rFonts w:ascii="Source Sans Pro" w:hAnsi="Source Sans Pro" w:cs="Arial"/>
-                <w:bCs/>
-                <w:snapToGrid w:val="0"/>
-                <w:szCs w:val="16"/>
-              </w:rPr>
-              <w:t xml:space="preserve">et </w:t>
-            </w:r>
-            <w:r>
-              <w:rPr>
-                <w:rFonts w:ascii="Source Sans Pro" w:hAnsi="Source Sans Pro" w:cs="Arial"/>
-                <w:bCs/>
-                <w:snapToGrid w:val="0"/>
-                <w:szCs w:val="16"/>
-              </w:rPr>
-              <w:t>horaires de session :</w:t>
-            </w:r>
-          </w:p>
-          <w:p>
-            <w:pPr>
-              <w:jc w:val="both"/>
-              <w:rPr>
-                <w:rFonts w:ascii="Source Sans Pro" w:hAnsi="Source Sans Pro" w:cs="Arial"/>
-                <w:bCs/>
-                <w:snapToGrid w:val="0"/>
-                <w:szCs w:val="16"/>
-              </w:rPr>
-            </w:pPr>
           </w:p>
         </w:tc>
         <w:tc>
@@ -695,7 +660,7 @@
               </w:rPr>
             </w:pPr>
             <w:r>
-              <w:t xml:space="preserve">{{ dates_previsionnelles }}</w:t>
+              <w:t xml:space="preserve">{{ dates_realisees }}</w:t>
             </w:r>
           </w:p>
         </w:tc>

</xml_diff>

<commit_message>
feat(certificat): ajoute les horaires des sessions sur le certificat de réalisation
- Nouvelle ligne "Horaires des sessions" dans le tableau stats du certificat
- Variable horaires_sessions construite depuis mc.horaires (dédupliqués)
- Fallback "À définir" si aucun horaire saisi

Co-Authored-By: Claude Sonnet 4.6 <noreply@anthropic.com>
</commit_message>
<xml_diff>
--- a/templates/certificat.docx
+++ b/templates/certificat.docx
@@ -661,6 +661,47 @@
             </w:pPr>
             <w:r>
               <w:t xml:space="preserve">{{ dates_realisees }}</w:t>
+            </w:r>
+          </w:p>
+        </w:tc>
+      </w:tr>
+      <w:tr>
+        <w:tc>
+          <w:tcPr>
+            <w:tcW w:w="4390" w:type="dxa"/>
+          </w:tcPr>
+          <w:p>
+            <w:pPr>
+              <w:jc w:val="both"/>
+              <w:rPr>
+                <w:rFonts w:ascii="Source Sans Pro" w:hAnsi="Source Sans Pro" w:cs="Arial"/>
+                <w:bCs/>
+                <w:snapToGrid w:val="0"/>
+                <w:szCs w:val="16"/>
+              </w:rPr>
+            </w:pPr>
+            <w:r>
+              <w:t xml:space="preserve">Horaires des sessions</w:t>
+            </w:r>
+          </w:p>
+        </w:tc>
+        <w:tc>
+          <w:tcPr>
+            <w:tcW w:w="5522" w:type="dxa"/>
+          </w:tcPr>
+          <w:p>
+            <w:pPr>
+              <w:jc w:val="both"/>
+              <w:rPr>
+                <w:rFonts w:ascii="Source Sans Pro" w:hAnsi="Source Sans Pro" w:cs="Arial"/>
+                <w:bCs/>
+                <w:i/>
+                <w:snapToGrid w:val="0"/>
+                <w:szCs w:val="16"/>
+              </w:rPr>
+            </w:pPr>
+            <w:r>
+              <w:t xml:space="preserve">{{ horaires_sessions }}</w:t>
             </w:r>
           </w:p>
         </w:tc>

</xml_diff>

<commit_message>
fix: mise à jour templates — nouveau n° déclaration DREETS 93040123104, suppression DataDock
- config/organisme.json : déclaration 82691206769 → 93040123104, suppression datadock, ajout dreets_region
- 3 templates docx : footer mis à jour (nouveau n°, DREETS PACA, date 08/03/2026), header nettoyé
- convention.docx corps : bloc bleu déclaration + ligne DataDock → DREETS
- Tags Jinja2 préservés intégralement dans les 3 templates

Co-Authored-By: Claude Sonnet 4.6 <noreply@anthropic.com>
</commit_message>
<xml_diff>
--- a/templates/certificat.docx
+++ b/templates/certificat.docx
@@ -1319,7 +1319,7 @@
         <w:sz w:val="16"/>
         <w:szCs w:val="16"/>
       </w:rPr>
-      <w:t xml:space="preserve">Déclaration d’activité enregistrée sous le n° 82691206769 auprès du </w:t>
+      <w:t>Déclaration d'activité enregistrée sous le n° 93040123104- Enregistrée auprès de la DREETS Provence-Alpes-Côte d'Azur</w:t>
     </w:r>
     <w:proofErr w:type="gramStart"/>
     <w:r>
@@ -1330,7 +1330,6 @@
         <w:sz w:val="16"/>
         <w:szCs w:val="16"/>
       </w:rPr>
-      <w:t>Préfet</w:t>
     </w:r>
     <w:proofErr w:type="gramEnd"/>
     <w:r>
@@ -1341,7 +1340,6 @@
         <w:sz w:val="16"/>
         <w:szCs w:val="16"/>
       </w:rPr>
-      <w:t xml:space="preserve"> de la région Rhône-Alpes</w:t>
     </w:r>
     <w:r>
       <w:rPr>
@@ -1351,7 +1349,6 @@
         <w:sz w:val="16"/>
         <w:szCs w:val="16"/>
       </w:rPr>
-      <w:t xml:space="preserve"> - </w:t>
     </w:r>
     <w:r>
       <w:rPr>
@@ -1361,7 +1358,6 @@
         <w:sz w:val="16"/>
         <w:szCs w:val="16"/>
       </w:rPr>
-      <w:t xml:space="preserve">Identifiant </w:t>
     </w:r>
     <w:proofErr w:type="spellStart"/>
     <w:r>
@@ -1372,7 +1368,6 @@
         <w:sz w:val="16"/>
         <w:szCs w:val="16"/>
       </w:rPr>
-      <w:t>DataDock</w:t>
     </w:r>
     <w:proofErr w:type="spellEnd"/>
     <w:r>
@@ -1383,7 +1378,29 @@
         <w:sz w:val="16"/>
         <w:szCs w:val="16"/>
       </w:rPr>
-      <w:t xml:space="preserve"> : 0029644</w:t>
+    </w:r>
+  </w:p>
+  <w:p>
+    <w:pPr>
+      <w:pStyle w:val="Pieddepage"/>
+      <w:jc w:val="center"/>
+      <w:rPr>
+        <w:rFonts w:ascii="Source Sans Pro" w:hAnsi="Source Sans Pro" w:cs="Arial"/>
+        <w:i/>
+        <w:color w:val="A6A6A6" w:themeColor="background1" w:themeShade="A6"/>
+        <w:sz w:val="16"/>
+        <w:szCs w:val="16"/>
+      </w:rPr>
+    </w:pPr>
+    <w:r>
+      <w:rPr>
+        <w:rFonts w:ascii="Source Sans Pro" w:hAnsi="Source Sans Pro" w:cs="Arial"/>
+        <w:i/>
+        <w:color w:val="A6A6A6" w:themeColor="background1" w:themeShade="A6"/>
+        <w:sz w:val="16"/>
+        <w:szCs w:val="16"/>
+      </w:rPr>
+      <w:t>[ Document mis à jour le 08/03/2026]</w:t>
     </w:r>
   </w:p>
   <w:p>
@@ -2036,7 +2053,6 @@
         <w:sz w:val="16"/>
         <w:szCs w:val="12"/>
       </w:rPr>
-      <w:t xml:space="preserve">Document mis à jour </w:t>
     </w:r>
     <w:r>
       <w:rPr>
@@ -2046,7 +2062,6 @@
         <w:sz w:val="16"/>
         <w:szCs w:val="12"/>
       </w:rPr>
-      <w:t>le 15/01/2026</w:t>
     </w:r>
   </w:p>
 </w:hdr>

</xml_diff>